<commit_message>
Assinatura com Chave Móvel Digital: PDF determinístico, verificação PAdES do PDF assinado, armazenamento imutável
Co-Authored-By: Claude Opus 5.5 <noreply@anthropic.com>
Claude-Session: https://claude.ai/code/session_01SPDKY3VBD8WnLPQg8GohVX
</commit_message>
<xml_diff>
--- a/docs/advogado/Pedido_minuta_contrato.docx
+++ b/docs/advogado/Pedido_minuta_contrato.docx
@@ -2762,6 +2762,42 @@
       </w:pPr>
       <w:r>
         <w:t xml:space="preserve">E3. Durante quanto tempo a plataforma deve conservar o contrato e as provas?</w:t>
+      </w:r>
+    </w:p>
+    <w:p>
+      <w:pPr>
+        <w:numPr>
+          <w:ilvl w:val="0"/>
+          <w:numId w:val="1011"/>
+        </w:numPr>
+        <w:pStyle w:val="Compact"/>
+      </w:pPr>
+      <w:r>
+        <w:t xml:space="preserve">E4. Por causa do anonimato, o cliente assina antes de saber quem é o pintor. O PDF assinado identifica as</w:t>
+      </w:r>
+      <w:r>
+        <w:t xml:space="preserve"> </w:t>
+      </w:r>
+      <w:r>
+        <w:t xml:space="preserve">partes pelo papel e pela referência da proposta; os nomes e números de identificação constam dos</w:t>
+      </w:r>
+      <w:r>
+        <w:t xml:space="preserve"> </w:t>
+      </w:r>
+      <w:r>
+        <w:t xml:space="preserve">certificados das assinaturas qualificadas, e os restantes dados (NIF, sede, morada da obra) ficam registados</w:t>
+      </w:r>
+      <w:r>
+        <w:t xml:space="preserve"> </w:t>
+      </w:r>
+      <w:r>
+        <w:t xml:space="preserve">na plataforma depois da apresentação. É suficiente, ou é preciso um anexo de identificação assinado pelas</w:t>
+      </w:r>
+      <w:r>
+        <w:t xml:space="preserve"> </w:t>
+      </w:r>
+      <w:r>
+        <w:t xml:space="preserve">duas partes depois da apresentação?</w:t>
       </w:r>
     </w:p>
     <w:p>

</xml_diff>